<commit_message>
docs: ampliar informe con tecnologias utilizadas y PDF
</commit_message>
<xml_diff>
--- a/docs/entrega/Informe-requisitos-de-alojamiento-Social-Audit-Pro.docx
+++ b/docs/entrega/Informe-requisitos-de-alojamiento-Social-Audit-Pro.docx
@@ -7,7 +7,7 @@
         <w:pStyle w:val="Title"/>
       </w:pPr>
       <w:r>
-        <w:t>Requisitos del dispositivo para trasladar y alojar Social Audit Pro</w:t>
+        <w:t>Tecnologías y requisitos para trasladar y alojar Social Audit Pro</w:t>
       </w:r>
     </w:p>
     <w:p>
@@ -1013,6 +1013,1420 @@
       </w:r>
     </w:p>
     <w:p>
+      <w:r>
+        <w:br w:type="page"/>
+      </w:r>
+    </w:p>
+    <w:p>
+      <w:pPr>
+        <w:pStyle w:val="Heading1"/>
+      </w:pPr>
+      <w:r>
+        <w:t>Tecnologías utilizadas en el proyecto</w:t>
+      </w:r>
+    </w:p>
+    <w:p>
+      <w:r>
+        <w:t>El sistema separa interfaz web, analítica, API REST, autenticación, persistencia, conectores y tareas de sincronización. La siguiente tabla distingue las tecnologías activas de los componentes preparados o pendientes de despliegue.</w:t>
+      </w:r>
+    </w:p>
+    <w:tbl>
+      <w:tblPr>
+        <w:tblW w:type="auto" w:w="0"/>
+        <w:jc w:val="center"/>
+        <w:tblLayout w:type="fixed"/>
+        <w:tblLook w:firstColumn="1" w:firstRow="1" w:lastColumn="0" w:lastRow="0" w:noHBand="0" w:noVBand="1" w:val="04A0"/>
+      </w:tblPr>
+      <w:tblGrid>
+        <w:gridCol w:w="1800"/>
+        <w:gridCol w:w="2592"/>
+        <w:gridCol w:w="5688"/>
+      </w:tblGrid>
+      <w:tr>
+        <w:trPr>
+          <w:cantSplit/>
+          <w:tblHeader/>
+        </w:trPr>
+        <w:tc>
+          <w:tcPr>
+            <w:tcW w:type="dxa" w:w="1800"/>
+            <w:vAlign w:val="center"/>
+            <w:shd w:fill="DFEAF2"/>
+            <w:tcMar>
+              <w:top w:w="100" w:type="dxa"/>
+              <w:left w:w="100" w:type="dxa"/>
+              <w:bottom w:w="100" w:type="dxa"/>
+              <w:right w:w="100" w:type="dxa"/>
+            </w:tcMar>
+            <w:tcBorders>
+              <w:top w:val="single" w:sz="4" w:color="D9D9D9"/>
+              <w:left w:val="single" w:sz="4" w:color="D9D9D9"/>
+              <w:bottom w:val="single" w:sz="4" w:color="D9D9D9"/>
+              <w:right w:val="single" w:sz="4" w:color="D9D9D9"/>
+            </w:tcBorders>
+          </w:tcPr>
+          <w:p>
+            <w:pPr>
+              <w:spacing w:after="60"/>
+            </w:pPr>
+            <w:r>
+              <w:rPr>
+                <w:b/>
+                <w:sz w:val="21"/>
+              </w:rPr>
+              <w:t>Componente</w:t>
+            </w:r>
+          </w:p>
+        </w:tc>
+        <w:tc>
+          <w:tcPr>
+            <w:tcW w:type="dxa" w:w="2592"/>
+            <w:vAlign w:val="center"/>
+            <w:shd w:fill="DFEAF2"/>
+            <w:tcMar>
+              <w:top w:w="100" w:type="dxa"/>
+              <w:left w:w="100" w:type="dxa"/>
+              <w:bottom w:w="100" w:type="dxa"/>
+              <w:right w:w="100" w:type="dxa"/>
+            </w:tcMar>
+            <w:tcBorders>
+              <w:top w:val="single" w:sz="4" w:color="D9D9D9"/>
+              <w:left w:val="single" w:sz="4" w:color="D9D9D9"/>
+              <w:bottom w:val="single" w:sz="4" w:color="D9D9D9"/>
+              <w:right w:val="single" w:sz="4" w:color="D9D9D9"/>
+            </w:tcBorders>
+          </w:tcPr>
+          <w:p>
+            <w:pPr>
+              <w:spacing w:after="60"/>
+            </w:pPr>
+            <w:r>
+              <w:rPr>
+                <w:b/>
+                <w:sz w:val="21"/>
+              </w:rPr>
+              <w:t>Tecnología</w:t>
+            </w:r>
+          </w:p>
+        </w:tc>
+        <w:tc>
+          <w:tcPr>
+            <w:tcW w:type="dxa" w:w="5688"/>
+            <w:vAlign w:val="center"/>
+            <w:shd w:fill="DFEAF2"/>
+            <w:tcMar>
+              <w:top w:w="100" w:type="dxa"/>
+              <w:left w:w="100" w:type="dxa"/>
+              <w:bottom w:w="100" w:type="dxa"/>
+              <w:right w:w="100" w:type="dxa"/>
+            </w:tcMar>
+            <w:tcBorders>
+              <w:top w:val="single" w:sz="4" w:color="D9D9D9"/>
+              <w:left w:val="single" w:sz="4" w:color="D9D9D9"/>
+              <w:bottom w:val="single" w:sz="4" w:color="D9D9D9"/>
+              <w:right w:val="single" w:sz="4" w:color="D9D9D9"/>
+            </w:tcBorders>
+          </w:tcPr>
+          <w:p>
+            <w:pPr>
+              <w:spacing w:after="60"/>
+            </w:pPr>
+            <w:r>
+              <w:rPr>
+                <w:b/>
+                <w:sz w:val="21"/>
+              </w:rPr>
+              <w:t>Uso y estado</w:t>
+            </w:r>
+          </w:p>
+        </w:tc>
+      </w:tr>
+      <w:tr>
+        <w:trPr>
+          <w:cantSplit/>
+        </w:trPr>
+        <w:tc>
+          <w:tcPr>
+            <w:tcW w:type="dxa" w:w="1800"/>
+            <w:vAlign w:val="center"/>
+            <w:shd w:fill="FFFFFF"/>
+            <w:tcMar>
+              <w:top w:w="100" w:type="dxa"/>
+              <w:left w:w="100" w:type="dxa"/>
+              <w:bottom w:w="100" w:type="dxa"/>
+              <w:right w:w="100" w:type="dxa"/>
+            </w:tcMar>
+            <w:tcBorders>
+              <w:top w:val="single" w:sz="4" w:color="D9D9D9"/>
+              <w:left w:val="single" w:sz="4" w:color="D9D9D9"/>
+              <w:bottom w:val="single" w:sz="4" w:color="D9D9D9"/>
+              <w:right w:val="single" w:sz="4" w:color="D9D9D9"/>
+            </w:tcBorders>
+          </w:tcPr>
+          <w:p>
+            <w:pPr>
+              <w:spacing w:after="60"/>
+            </w:pPr>
+            <w:r>
+              <w:rPr>
+                <w:b w:val="0"/>
+                <w:sz w:val="21"/>
+              </w:rPr>
+              <w:t>Interfaz y gráficos</w:t>
+            </w:r>
+          </w:p>
+        </w:tc>
+        <w:tc>
+          <w:tcPr>
+            <w:tcW w:type="dxa" w:w="2592"/>
+            <w:vAlign w:val="center"/>
+            <w:shd w:fill="FFFFFF"/>
+            <w:tcMar>
+              <w:top w:w="100" w:type="dxa"/>
+              <w:left w:w="100" w:type="dxa"/>
+              <w:bottom w:w="100" w:type="dxa"/>
+              <w:right w:w="100" w:type="dxa"/>
+            </w:tcMar>
+            <w:tcBorders>
+              <w:top w:val="single" w:sz="4" w:color="D9D9D9"/>
+              <w:left w:val="single" w:sz="4" w:color="D9D9D9"/>
+              <w:bottom w:val="single" w:sz="4" w:color="D9D9D9"/>
+              <w:right w:val="single" w:sz="4" w:color="D9D9D9"/>
+            </w:tcBorders>
+          </w:tcPr>
+          <w:p>
+            <w:pPr>
+              <w:spacing w:after="60"/>
+            </w:pPr>
+            <w:r>
+              <w:rPr>
+                <w:b w:val="0"/>
+                <w:sz w:val="21"/>
+              </w:rPr>
+              <w:t>HTML, CSS y JavaScript</w:t>
+            </w:r>
+          </w:p>
+        </w:tc>
+        <w:tc>
+          <w:tcPr>
+            <w:tcW w:type="dxa" w:w="5688"/>
+            <w:vAlign w:val="center"/>
+            <w:shd w:fill="FFFFFF"/>
+            <w:tcMar>
+              <w:top w:w="100" w:type="dxa"/>
+              <w:left w:w="100" w:type="dxa"/>
+              <w:bottom w:w="100" w:type="dxa"/>
+              <w:right w:w="100" w:type="dxa"/>
+            </w:tcMar>
+            <w:tcBorders>
+              <w:top w:val="single" w:sz="4" w:color="D9D9D9"/>
+              <w:left w:val="single" w:sz="4" w:color="D9D9D9"/>
+              <w:bottom w:val="single" w:sz="4" w:color="D9D9D9"/>
+              <w:right w:val="single" w:sz="4" w:color="D9D9D9"/>
+            </w:tcBorders>
+          </w:tcPr>
+          <w:p>
+            <w:pPr>
+              <w:spacing w:after="60"/>
+            </w:pPr>
+            <w:r>
+              <w:rPr>
+                <w:b w:val="0"/>
+                <w:sz w:val="21"/>
+              </w:rPr>
+              <w:t>Vistas, filtros, cálculos y gráficos propios. Sin React, Angular ni Chart.js.</w:t>
+            </w:r>
+          </w:p>
+        </w:tc>
+      </w:tr>
+      <w:tr>
+        <w:trPr>
+          <w:cantSplit/>
+        </w:trPr>
+        <w:tc>
+          <w:tcPr>
+            <w:tcW w:type="dxa" w:w="1800"/>
+            <w:vAlign w:val="center"/>
+            <w:shd w:fill="FFFFFF"/>
+            <w:tcMar>
+              <w:top w:w="100" w:type="dxa"/>
+              <w:left w:w="100" w:type="dxa"/>
+              <w:bottom w:w="100" w:type="dxa"/>
+              <w:right w:w="100" w:type="dxa"/>
+            </w:tcMar>
+            <w:tcBorders>
+              <w:top w:val="single" w:sz="4" w:color="D9D9D9"/>
+              <w:left w:val="single" w:sz="4" w:color="D9D9D9"/>
+              <w:bottom w:val="single" w:sz="4" w:color="D9D9D9"/>
+              <w:right w:val="single" w:sz="4" w:color="D9D9D9"/>
+            </w:tcBorders>
+          </w:tcPr>
+          <w:p>
+            <w:pPr>
+              <w:spacing w:after="60"/>
+            </w:pPr>
+            <w:r>
+              <w:rPr>
+                <w:b w:val="0"/>
+                <w:sz w:val="21"/>
+              </w:rPr>
+              <w:t>Backend</w:t>
+            </w:r>
+          </w:p>
+        </w:tc>
+        <w:tc>
+          <w:tcPr>
+            <w:tcW w:type="dxa" w:w="2592"/>
+            <w:vAlign w:val="center"/>
+            <w:shd w:fill="FFFFFF"/>
+            <w:tcMar>
+              <w:top w:w="100" w:type="dxa"/>
+              <w:left w:w="100" w:type="dxa"/>
+              <w:bottom w:w="100" w:type="dxa"/>
+              <w:right w:w="100" w:type="dxa"/>
+            </w:tcMar>
+            <w:tcBorders>
+              <w:top w:val="single" w:sz="4" w:color="D9D9D9"/>
+              <w:left w:val="single" w:sz="4" w:color="D9D9D9"/>
+              <w:bottom w:val="single" w:sz="4" w:color="D9D9D9"/>
+              <w:right w:val="single" w:sz="4" w:color="D9D9D9"/>
+            </w:tcBorders>
+          </w:tcPr>
+          <w:p>
+            <w:pPr>
+              <w:spacing w:after="60"/>
+            </w:pPr>
+            <w:r>
+              <w:rPr>
+                <w:b w:val="0"/>
+                <w:sz w:val="21"/>
+              </w:rPr>
+              <w:t>Node.js y Express</w:t>
+            </w:r>
+          </w:p>
+        </w:tc>
+        <w:tc>
+          <w:tcPr>
+            <w:tcW w:type="dxa" w:w="5688"/>
+            <w:vAlign w:val="center"/>
+            <w:shd w:fill="FFFFFF"/>
+            <w:tcMar>
+              <w:top w:w="100" w:type="dxa"/>
+              <w:left w:w="100" w:type="dxa"/>
+              <w:bottom w:w="100" w:type="dxa"/>
+              <w:right w:w="100" w:type="dxa"/>
+            </w:tcMar>
+            <w:tcBorders>
+              <w:top w:val="single" w:sz="4" w:color="D9D9D9"/>
+              <w:left w:val="single" w:sz="4" w:color="D9D9D9"/>
+              <w:bottom w:val="single" w:sz="4" w:color="D9D9D9"/>
+              <w:right w:val="single" w:sz="4" w:color="D9D9D9"/>
+            </w:tcBorders>
+          </w:tcPr>
+          <w:p>
+            <w:pPr>
+              <w:spacing w:after="60"/>
+            </w:pPr>
+            <w:r>
+              <w:rPr>
+                <w:b w:val="0"/>
+                <w:sz w:val="21"/>
+              </w:rPr>
+              <w:t>API REST bajo /api/v1, permisos y ejecución del servidor local.</w:t>
+            </w:r>
+          </w:p>
+        </w:tc>
+      </w:tr>
+      <w:tr>
+        <w:trPr>
+          <w:cantSplit/>
+        </w:trPr>
+        <w:tc>
+          <w:tcPr>
+            <w:tcW w:type="dxa" w:w="1800"/>
+            <w:vAlign w:val="center"/>
+            <w:shd w:fill="FFFFFF"/>
+            <w:tcMar>
+              <w:top w:w="100" w:type="dxa"/>
+              <w:left w:w="100" w:type="dxa"/>
+              <w:bottom w:w="100" w:type="dxa"/>
+              <w:right w:w="100" w:type="dxa"/>
+            </w:tcMar>
+            <w:tcBorders>
+              <w:top w:val="single" w:sz="4" w:color="D9D9D9"/>
+              <w:left w:val="single" w:sz="4" w:color="D9D9D9"/>
+              <w:bottom w:val="single" w:sz="4" w:color="D9D9D9"/>
+              <w:right w:val="single" w:sz="4" w:color="D9D9D9"/>
+            </w:tcBorders>
+          </w:tcPr>
+          <w:p>
+            <w:pPr>
+              <w:spacing w:after="60"/>
+            </w:pPr>
+            <w:r>
+              <w:rPr>
+                <w:b w:val="0"/>
+                <w:sz w:val="21"/>
+              </w:rPr>
+              <w:t>Base de datos activa</w:t>
+            </w:r>
+          </w:p>
+        </w:tc>
+        <w:tc>
+          <w:tcPr>
+            <w:tcW w:type="dxa" w:w="2592"/>
+            <w:vAlign w:val="center"/>
+            <w:shd w:fill="FFFFFF"/>
+            <w:tcMar>
+              <w:top w:w="100" w:type="dxa"/>
+              <w:left w:w="100" w:type="dxa"/>
+              <w:bottom w:w="100" w:type="dxa"/>
+              <w:right w:w="100" w:type="dxa"/>
+            </w:tcMar>
+            <w:tcBorders>
+              <w:top w:val="single" w:sz="4" w:color="D9D9D9"/>
+              <w:left w:val="single" w:sz="4" w:color="D9D9D9"/>
+              <w:bottom w:val="single" w:sz="4" w:color="D9D9D9"/>
+              <w:right w:val="single" w:sz="4" w:color="D9D9D9"/>
+            </w:tcBorders>
+          </w:tcPr>
+          <w:p>
+            <w:pPr>
+              <w:spacing w:after="60"/>
+            </w:pPr>
+            <w:r>
+              <w:rPr>
+                <w:b w:val="0"/>
+                <w:sz w:val="21"/>
+              </w:rPr>
+              <w:t>SQLite y better-sqlite3</w:t>
+            </w:r>
+          </w:p>
+        </w:tc>
+        <w:tc>
+          <w:tcPr>
+            <w:tcW w:type="dxa" w:w="5688"/>
+            <w:vAlign w:val="center"/>
+            <w:shd w:fill="FFFFFF"/>
+            <w:tcMar>
+              <w:top w:w="100" w:type="dxa"/>
+              <w:left w:w="100" w:type="dxa"/>
+              <w:bottom w:w="100" w:type="dxa"/>
+              <w:right w:w="100" w:type="dxa"/>
+            </w:tcMar>
+            <w:tcBorders>
+              <w:top w:val="single" w:sz="4" w:color="D9D9D9"/>
+              <w:left w:val="single" w:sz="4" w:color="D9D9D9"/>
+              <w:bottom w:val="single" w:sz="4" w:color="D9D9D9"/>
+              <w:right w:val="single" w:sz="4" w:color="D9D9D9"/>
+            </w:tcBorders>
+          </w:tcPr>
+          <w:p>
+            <w:pPr>
+              <w:spacing w:after="60"/>
+            </w:pPr>
+            <w:r>
+              <w:rPr>
+                <w:b w:val="0"/>
+                <w:sz w:val="21"/>
+              </w:rPr>
+              <w:t>Archivo persistente local para usuarios, sesiones, organizaciones, publicaciones, históricos y reportes.</w:t>
+            </w:r>
+          </w:p>
+        </w:tc>
+      </w:tr>
+      <w:tr>
+        <w:trPr>
+          <w:cantSplit/>
+        </w:trPr>
+        <w:tc>
+          <w:tcPr>
+            <w:tcW w:type="dxa" w:w="1800"/>
+            <w:vAlign w:val="center"/>
+            <w:shd w:fill="FFFFFF"/>
+            <w:tcMar>
+              <w:top w:w="100" w:type="dxa"/>
+              <w:left w:w="100" w:type="dxa"/>
+              <w:bottom w:w="100" w:type="dxa"/>
+              <w:right w:w="100" w:type="dxa"/>
+            </w:tcMar>
+            <w:tcBorders>
+              <w:top w:val="single" w:sz="4" w:color="D9D9D9"/>
+              <w:left w:val="single" w:sz="4" w:color="D9D9D9"/>
+              <w:bottom w:val="single" w:sz="4" w:color="D9D9D9"/>
+              <w:right w:val="single" w:sz="4" w:color="D9D9D9"/>
+            </w:tcBorders>
+          </w:tcPr>
+          <w:p>
+            <w:pPr>
+              <w:spacing w:after="60"/>
+            </w:pPr>
+            <w:r>
+              <w:rPr>
+                <w:b w:val="0"/>
+                <w:sz w:val="21"/>
+              </w:rPr>
+              <w:t>Reportes</w:t>
+            </w:r>
+          </w:p>
+        </w:tc>
+        <w:tc>
+          <w:tcPr>
+            <w:tcW w:type="dxa" w:w="2592"/>
+            <w:vAlign w:val="center"/>
+            <w:shd w:fill="FFFFFF"/>
+            <w:tcMar>
+              <w:top w:w="100" w:type="dxa"/>
+              <w:left w:w="100" w:type="dxa"/>
+              <w:bottom w:w="100" w:type="dxa"/>
+              <w:right w:w="100" w:type="dxa"/>
+            </w:tcMar>
+            <w:tcBorders>
+              <w:top w:val="single" w:sz="4" w:color="D9D9D9"/>
+              <w:left w:val="single" w:sz="4" w:color="D9D9D9"/>
+              <w:bottom w:val="single" w:sz="4" w:color="D9D9D9"/>
+              <w:right w:val="single" w:sz="4" w:color="D9D9D9"/>
+            </w:tcBorders>
+          </w:tcPr>
+          <w:p>
+            <w:pPr>
+              <w:spacing w:after="60"/>
+            </w:pPr>
+            <w:r>
+              <w:rPr>
+                <w:b w:val="0"/>
+                <w:sz w:val="21"/>
+              </w:rPr>
+              <w:t>PDFKit</w:t>
+            </w:r>
+          </w:p>
+        </w:tc>
+        <w:tc>
+          <w:tcPr>
+            <w:tcW w:type="dxa" w:w="5688"/>
+            <w:vAlign w:val="center"/>
+            <w:shd w:fill="FFFFFF"/>
+            <w:tcMar>
+              <w:top w:w="100" w:type="dxa"/>
+              <w:left w:w="100" w:type="dxa"/>
+              <w:bottom w:w="100" w:type="dxa"/>
+              <w:right w:w="100" w:type="dxa"/>
+            </w:tcMar>
+            <w:tcBorders>
+              <w:top w:val="single" w:sz="4" w:color="D9D9D9"/>
+              <w:left w:val="single" w:sz="4" w:color="D9D9D9"/>
+              <w:bottom w:val="single" w:sz="4" w:color="D9D9D9"/>
+              <w:right w:val="single" w:sz="4" w:color="D9D9D9"/>
+            </w:tcBorders>
+          </w:tcPr>
+          <w:p>
+            <w:pPr>
+              <w:spacing w:after="60"/>
+            </w:pPr>
+            <w:r>
+              <w:rPr>
+                <w:b w:val="0"/>
+                <w:sz w:val="21"/>
+              </w:rPr>
+              <w:t>Generación de documentos PDF desde el backend.</w:t>
+            </w:r>
+          </w:p>
+        </w:tc>
+      </w:tr>
+      <w:tr>
+        <w:trPr>
+          <w:cantSplit/>
+        </w:trPr>
+        <w:tc>
+          <w:tcPr>
+            <w:tcW w:type="dxa" w:w="1800"/>
+            <w:vAlign w:val="center"/>
+            <w:shd w:fill="FFFFFF"/>
+            <w:tcMar>
+              <w:top w:w="100" w:type="dxa"/>
+              <w:left w:w="100" w:type="dxa"/>
+              <w:bottom w:w="100" w:type="dxa"/>
+              <w:right w:w="100" w:type="dxa"/>
+            </w:tcMar>
+            <w:tcBorders>
+              <w:top w:val="single" w:sz="4" w:color="D9D9D9"/>
+              <w:left w:val="single" w:sz="4" w:color="D9D9D9"/>
+              <w:bottom w:val="single" w:sz="4" w:color="D9D9D9"/>
+              <w:right w:val="single" w:sz="4" w:color="D9D9D9"/>
+            </w:tcBorders>
+          </w:tcPr>
+          <w:p>
+            <w:pPr>
+              <w:spacing w:after="60"/>
+            </w:pPr>
+            <w:r>
+              <w:rPr>
+                <w:b w:val="0"/>
+                <w:sz w:val="21"/>
+              </w:rPr>
+              <w:t>Correo</w:t>
+            </w:r>
+          </w:p>
+        </w:tc>
+        <w:tc>
+          <w:tcPr>
+            <w:tcW w:type="dxa" w:w="2592"/>
+            <w:vAlign w:val="center"/>
+            <w:shd w:fill="FFFFFF"/>
+            <w:tcMar>
+              <w:top w:w="100" w:type="dxa"/>
+              <w:left w:w="100" w:type="dxa"/>
+              <w:bottom w:w="100" w:type="dxa"/>
+              <w:right w:w="100" w:type="dxa"/>
+            </w:tcMar>
+            <w:tcBorders>
+              <w:top w:val="single" w:sz="4" w:color="D9D9D9"/>
+              <w:left w:val="single" w:sz="4" w:color="D9D9D9"/>
+              <w:bottom w:val="single" w:sz="4" w:color="D9D9D9"/>
+              <w:right w:val="single" w:sz="4" w:color="D9D9D9"/>
+            </w:tcBorders>
+          </w:tcPr>
+          <w:p>
+            <w:pPr>
+              <w:spacing w:after="60"/>
+            </w:pPr>
+            <w:r>
+              <w:rPr>
+                <w:b w:val="0"/>
+                <w:sz w:val="21"/>
+              </w:rPr>
+              <w:t>Nodemailer y Microsoft Graph</w:t>
+            </w:r>
+          </w:p>
+        </w:tc>
+        <w:tc>
+          <w:tcPr>
+            <w:tcW w:type="dxa" w:w="5688"/>
+            <w:vAlign w:val="center"/>
+            <w:shd w:fill="FFFFFF"/>
+            <w:tcMar>
+              <w:top w:w="100" w:type="dxa"/>
+              <w:left w:w="100" w:type="dxa"/>
+              <w:bottom w:w="100" w:type="dxa"/>
+              <w:right w:w="100" w:type="dxa"/>
+            </w:tcMar>
+            <w:tcBorders>
+              <w:top w:val="single" w:sz="4" w:color="D9D9D9"/>
+              <w:left w:val="single" w:sz="4" w:color="D9D9D9"/>
+              <w:bottom w:val="single" w:sz="4" w:color="D9D9D9"/>
+              <w:right w:val="single" w:sz="4" w:color="D9D9D9"/>
+            </w:tcBorders>
+          </w:tcPr>
+          <w:p>
+            <w:pPr>
+              <w:spacing w:after="60"/>
+            </w:pPr>
+            <w:r>
+              <w:rPr>
+                <w:b w:val="0"/>
+                <w:sz w:val="21"/>
+              </w:rPr>
+              <w:t>SMTP disponible; transporte Microsoft 365 preparado, sujeto a autorización y configuración real.</w:t>
+            </w:r>
+          </w:p>
+        </w:tc>
+      </w:tr>
+      <w:tr>
+        <w:trPr>
+          <w:cantSplit/>
+        </w:trPr>
+        <w:tc>
+          <w:tcPr>
+            <w:tcW w:type="dxa" w:w="1800"/>
+            <w:vAlign w:val="center"/>
+            <w:shd w:fill="FFFFFF"/>
+            <w:tcMar>
+              <w:top w:w="100" w:type="dxa"/>
+              <w:left w:w="100" w:type="dxa"/>
+              <w:bottom w:w="100" w:type="dxa"/>
+              <w:right w:w="100" w:type="dxa"/>
+            </w:tcMar>
+            <w:tcBorders>
+              <w:top w:val="single" w:sz="4" w:color="D9D9D9"/>
+              <w:left w:val="single" w:sz="4" w:color="D9D9D9"/>
+              <w:bottom w:val="single" w:sz="4" w:color="D9D9D9"/>
+              <w:right w:val="single" w:sz="4" w:color="D9D9D9"/>
+            </w:tcBorders>
+          </w:tcPr>
+          <w:p>
+            <w:pPr>
+              <w:spacing w:after="60"/>
+            </w:pPr>
+            <w:r>
+              <w:rPr>
+                <w:b w:val="0"/>
+                <w:sz w:val="21"/>
+              </w:rPr>
+              <w:t>Segundo factor</w:t>
+            </w:r>
+          </w:p>
+        </w:tc>
+        <w:tc>
+          <w:tcPr>
+            <w:tcW w:type="dxa" w:w="2592"/>
+            <w:vAlign w:val="center"/>
+            <w:shd w:fill="FFFFFF"/>
+            <w:tcMar>
+              <w:top w:w="100" w:type="dxa"/>
+              <w:left w:w="100" w:type="dxa"/>
+              <w:bottom w:w="100" w:type="dxa"/>
+              <w:right w:w="100" w:type="dxa"/>
+            </w:tcMar>
+            <w:tcBorders>
+              <w:top w:val="single" w:sz="4" w:color="D9D9D9"/>
+              <w:left w:val="single" w:sz="4" w:color="D9D9D9"/>
+              <w:bottom w:val="single" w:sz="4" w:color="D9D9D9"/>
+              <w:right w:val="single" w:sz="4" w:color="D9D9D9"/>
+            </w:tcBorders>
+          </w:tcPr>
+          <w:p>
+            <w:pPr>
+              <w:spacing w:after="60"/>
+            </w:pPr>
+            <w:r>
+              <w:rPr>
+                <w:b w:val="0"/>
+                <w:sz w:val="21"/>
+              </w:rPr>
+              <w:t>otplib y qrcode</w:t>
+            </w:r>
+          </w:p>
+        </w:tc>
+        <w:tc>
+          <w:tcPr>
+            <w:tcW w:type="dxa" w:w="5688"/>
+            <w:vAlign w:val="center"/>
+            <w:shd w:fill="FFFFFF"/>
+            <w:tcMar>
+              <w:top w:w="100" w:type="dxa"/>
+              <w:left w:w="100" w:type="dxa"/>
+              <w:bottom w:w="100" w:type="dxa"/>
+              <w:right w:w="100" w:type="dxa"/>
+            </w:tcMar>
+            <w:tcBorders>
+              <w:top w:val="single" w:sz="4" w:color="D9D9D9"/>
+              <w:left w:val="single" w:sz="4" w:color="D9D9D9"/>
+              <w:bottom w:val="single" w:sz="4" w:color="D9D9D9"/>
+              <w:right w:val="single" w:sz="4" w:color="D9D9D9"/>
+            </w:tcBorders>
+          </w:tcPr>
+          <w:p>
+            <w:pPr>
+              <w:spacing w:after="60"/>
+            </w:pPr>
+            <w:r>
+              <w:rPr>
+                <w:b w:val="0"/>
+                <w:sz w:val="21"/>
+              </w:rPr>
+              <w:t>Códigos TOTP y QR para configurar autenticadores.</w:t>
+            </w:r>
+          </w:p>
+        </w:tc>
+      </w:tr>
+      <w:tr>
+        <w:trPr>
+          <w:cantSplit/>
+        </w:trPr>
+        <w:tc>
+          <w:tcPr>
+            <w:tcW w:type="dxa" w:w="1800"/>
+            <w:vAlign w:val="center"/>
+            <w:shd w:fill="FFFFFF"/>
+            <w:tcMar>
+              <w:top w:w="100" w:type="dxa"/>
+              <w:left w:w="100" w:type="dxa"/>
+              <w:bottom w:w="100" w:type="dxa"/>
+              <w:right w:w="100" w:type="dxa"/>
+            </w:tcMar>
+            <w:tcBorders>
+              <w:top w:val="single" w:sz="4" w:color="D9D9D9"/>
+              <w:left w:val="single" w:sz="4" w:color="D9D9D9"/>
+              <w:bottom w:val="single" w:sz="4" w:color="D9D9D9"/>
+              <w:right w:val="single" w:sz="4" w:color="D9D9D9"/>
+            </w:tcBorders>
+          </w:tcPr>
+          <w:p>
+            <w:pPr>
+              <w:spacing w:after="60"/>
+            </w:pPr>
+            <w:r>
+              <w:rPr>
+                <w:b w:val="0"/>
+                <w:sz w:val="21"/>
+              </w:rPr>
+              <w:t>APIs de redes</w:t>
+            </w:r>
+          </w:p>
+        </w:tc>
+        <w:tc>
+          <w:tcPr>
+            <w:tcW w:type="dxa" w:w="2592"/>
+            <w:vAlign w:val="center"/>
+            <w:shd w:fill="FFFFFF"/>
+            <w:tcMar>
+              <w:top w:w="100" w:type="dxa"/>
+              <w:left w:w="100" w:type="dxa"/>
+              <w:bottom w:w="100" w:type="dxa"/>
+              <w:right w:w="100" w:type="dxa"/>
+            </w:tcMar>
+            <w:tcBorders>
+              <w:top w:val="single" w:sz="4" w:color="D9D9D9"/>
+              <w:left w:val="single" w:sz="4" w:color="D9D9D9"/>
+              <w:bottom w:val="single" w:sz="4" w:color="D9D9D9"/>
+              <w:right w:val="single" w:sz="4" w:color="D9D9D9"/>
+            </w:tcBorders>
+          </w:tcPr>
+          <w:p>
+            <w:pPr>
+              <w:spacing w:after="60"/>
+            </w:pPr>
+            <w:r>
+              <w:rPr>
+                <w:b w:val="0"/>
+                <w:sz w:val="21"/>
+              </w:rPr>
+              <w:t>googleapis y adaptadores OAuth</w:t>
+            </w:r>
+          </w:p>
+        </w:tc>
+        <w:tc>
+          <w:tcPr>
+            <w:tcW w:type="dxa" w:w="5688"/>
+            <w:vAlign w:val="center"/>
+            <w:shd w:fill="FFFFFF"/>
+            <w:tcMar>
+              <w:top w:w="100" w:type="dxa"/>
+              <w:left w:w="100" w:type="dxa"/>
+              <w:bottom w:w="100" w:type="dxa"/>
+              <w:right w:w="100" w:type="dxa"/>
+            </w:tcMar>
+            <w:tcBorders>
+              <w:top w:val="single" w:sz="4" w:color="D9D9D9"/>
+              <w:left w:val="single" w:sz="4" w:color="D9D9D9"/>
+              <w:bottom w:val="single" w:sz="4" w:color="D9D9D9"/>
+              <w:right w:val="single" w:sz="4" w:color="D9D9D9"/>
+            </w:tcBorders>
+          </w:tcPr>
+          <w:p>
+            <w:pPr>
+              <w:spacing w:after="60"/>
+            </w:pPr>
+            <w:r>
+              <w:rPr>
+                <w:b w:val="0"/>
+                <w:sz w:val="21"/>
+              </w:rPr>
+              <w:t>YouTube, Facebook, Instagram, TikTok, LinkedIn y X. Su implementación no confirma conexión real; necesitan permisos, credenciales y validación. X está bloqueado por presupuesto.</w:t>
+            </w:r>
+          </w:p>
+        </w:tc>
+      </w:tr>
+      <w:tr>
+        <w:trPr>
+          <w:cantSplit/>
+        </w:trPr>
+        <w:tc>
+          <w:tcPr>
+            <w:tcW w:type="dxa" w:w="1800"/>
+            <w:vAlign w:val="center"/>
+            <w:shd w:fill="FFFFFF"/>
+            <w:tcMar>
+              <w:top w:w="100" w:type="dxa"/>
+              <w:left w:w="100" w:type="dxa"/>
+              <w:bottom w:w="100" w:type="dxa"/>
+              <w:right w:w="100" w:type="dxa"/>
+            </w:tcMar>
+            <w:tcBorders>
+              <w:top w:val="single" w:sz="4" w:color="D9D9D9"/>
+              <w:left w:val="single" w:sz="4" w:color="D9D9D9"/>
+              <w:bottom w:val="single" w:sz="4" w:color="D9D9D9"/>
+              <w:right w:val="single" w:sz="4" w:color="D9D9D9"/>
+            </w:tcBorders>
+          </w:tcPr>
+          <w:p>
+            <w:pPr>
+              <w:spacing w:after="60"/>
+            </w:pPr>
+            <w:r>
+              <w:rPr>
+                <w:b w:val="0"/>
+                <w:sz w:val="21"/>
+              </w:rPr>
+              <w:t>Configuración</w:t>
+            </w:r>
+          </w:p>
+        </w:tc>
+        <w:tc>
+          <w:tcPr>
+            <w:tcW w:type="dxa" w:w="2592"/>
+            <w:vAlign w:val="center"/>
+            <w:shd w:fill="FFFFFF"/>
+            <w:tcMar>
+              <w:top w:w="100" w:type="dxa"/>
+              <w:left w:w="100" w:type="dxa"/>
+              <w:bottom w:w="100" w:type="dxa"/>
+              <w:right w:w="100" w:type="dxa"/>
+            </w:tcMar>
+            <w:tcBorders>
+              <w:top w:val="single" w:sz="4" w:color="D9D9D9"/>
+              <w:left w:val="single" w:sz="4" w:color="D9D9D9"/>
+              <w:bottom w:val="single" w:sz="4" w:color="D9D9D9"/>
+              <w:right w:val="single" w:sz="4" w:color="D9D9D9"/>
+            </w:tcBorders>
+          </w:tcPr>
+          <w:p>
+            <w:pPr>
+              <w:spacing w:after="60"/>
+            </w:pPr>
+            <w:r>
+              <w:rPr>
+                <w:b w:val="0"/>
+                <w:sz w:val="21"/>
+              </w:rPr>
+              <w:t>dotenv</w:t>
+            </w:r>
+          </w:p>
+        </w:tc>
+        <w:tc>
+          <w:tcPr>
+            <w:tcW w:type="dxa" w:w="5688"/>
+            <w:vAlign w:val="center"/>
+            <w:shd w:fill="FFFFFF"/>
+            <w:tcMar>
+              <w:top w:w="100" w:type="dxa"/>
+              <w:left w:w="100" w:type="dxa"/>
+              <w:bottom w:w="100" w:type="dxa"/>
+              <w:right w:w="100" w:type="dxa"/>
+            </w:tcMar>
+            <w:tcBorders>
+              <w:top w:val="single" w:sz="4" w:color="D9D9D9"/>
+              <w:left w:val="single" w:sz="4" w:color="D9D9D9"/>
+              <w:bottom w:val="single" w:sz="4" w:color="D9D9D9"/>
+              <w:right w:val="single" w:sz="4" w:color="D9D9D9"/>
+            </w:tcBorders>
+          </w:tcPr>
+          <w:p>
+            <w:pPr>
+              <w:spacing w:after="60"/>
+            </w:pPr>
+            <w:r>
+              <w:rPr>
+                <w:b w:val="0"/>
+                <w:sz w:val="21"/>
+              </w:rPr>
+              <w:t>Lectura de variables privadas del entorno. Los secretos no se guardan en GitHub.</w:t>
+            </w:r>
+          </w:p>
+        </w:tc>
+      </w:tr>
+      <w:tr>
+        <w:trPr>
+          <w:cantSplit/>
+        </w:trPr>
+        <w:tc>
+          <w:tcPr>
+            <w:tcW w:type="dxa" w:w="1800"/>
+            <w:vAlign w:val="center"/>
+            <w:shd w:fill="FFFFFF"/>
+            <w:tcMar>
+              <w:top w:w="100" w:type="dxa"/>
+              <w:left w:w="100" w:type="dxa"/>
+              <w:bottom w:w="100" w:type="dxa"/>
+              <w:right w:w="100" w:type="dxa"/>
+            </w:tcMar>
+            <w:tcBorders>
+              <w:top w:val="single" w:sz="4" w:color="D9D9D9"/>
+              <w:left w:val="single" w:sz="4" w:color="D9D9D9"/>
+              <w:bottom w:val="single" w:sz="4" w:color="D9D9D9"/>
+              <w:right w:val="single" w:sz="4" w:color="D9D9D9"/>
+            </w:tcBorders>
+          </w:tcPr>
+          <w:p>
+            <w:pPr>
+              <w:spacing w:after="60"/>
+            </w:pPr>
+            <w:r>
+              <w:rPr>
+                <w:b w:val="0"/>
+                <w:sz w:val="21"/>
+              </w:rPr>
+              <w:t>Pruebas</w:t>
+            </w:r>
+          </w:p>
+        </w:tc>
+        <w:tc>
+          <w:tcPr>
+            <w:tcW w:type="dxa" w:w="2592"/>
+            <w:vAlign w:val="center"/>
+            <w:shd w:fill="FFFFFF"/>
+            <w:tcMar>
+              <w:top w:w="100" w:type="dxa"/>
+              <w:left w:w="100" w:type="dxa"/>
+              <w:bottom w:w="100" w:type="dxa"/>
+              <w:right w:w="100" w:type="dxa"/>
+            </w:tcMar>
+            <w:tcBorders>
+              <w:top w:val="single" w:sz="4" w:color="D9D9D9"/>
+              <w:left w:val="single" w:sz="4" w:color="D9D9D9"/>
+              <w:bottom w:val="single" w:sz="4" w:color="D9D9D9"/>
+              <w:right w:val="single" w:sz="4" w:color="D9D9D9"/>
+            </w:tcBorders>
+          </w:tcPr>
+          <w:p>
+            <w:pPr>
+              <w:spacing w:after="60"/>
+            </w:pPr>
+            <w:r>
+              <w:rPr>
+                <w:b w:val="0"/>
+                <w:sz w:val="21"/>
+              </w:rPr>
+              <w:t>node:test y Supertest</w:t>
+            </w:r>
+          </w:p>
+        </w:tc>
+        <w:tc>
+          <w:tcPr>
+            <w:tcW w:type="dxa" w:w="5688"/>
+            <w:vAlign w:val="center"/>
+            <w:shd w:fill="FFFFFF"/>
+            <w:tcMar>
+              <w:top w:w="100" w:type="dxa"/>
+              <w:left w:w="100" w:type="dxa"/>
+              <w:bottom w:w="100" w:type="dxa"/>
+              <w:right w:w="100" w:type="dxa"/>
+            </w:tcMar>
+            <w:tcBorders>
+              <w:top w:val="single" w:sz="4" w:color="D9D9D9"/>
+              <w:left w:val="single" w:sz="4" w:color="D9D9D9"/>
+              <w:bottom w:val="single" w:sz="4" w:color="D9D9D9"/>
+              <w:right w:val="single" w:sz="4" w:color="D9D9D9"/>
+            </w:tcBorders>
+          </w:tcPr>
+          <w:p>
+            <w:pPr>
+              <w:spacing w:after="60"/>
+            </w:pPr>
+            <w:r>
+              <w:rPr>
+                <w:b w:val="0"/>
+                <w:sz w:val="21"/>
+              </w:rPr>
+              <w:t>Pruebas unitarias y HTTP. PGlite se usa en pruebas de adaptadores PostgreSQL.</w:t>
+            </w:r>
+          </w:p>
+        </w:tc>
+      </w:tr>
+      <w:tr>
+        <w:trPr>
+          <w:cantSplit/>
+        </w:trPr>
+        <w:tc>
+          <w:tcPr>
+            <w:tcW w:type="dxa" w:w="1800"/>
+            <w:vAlign w:val="center"/>
+            <w:shd w:fill="FFFFFF"/>
+            <w:tcMar>
+              <w:top w:w="100" w:type="dxa"/>
+              <w:left w:w="100" w:type="dxa"/>
+              <w:bottom w:w="100" w:type="dxa"/>
+              <w:right w:w="100" w:type="dxa"/>
+            </w:tcMar>
+            <w:tcBorders>
+              <w:top w:val="single" w:sz="4" w:color="D9D9D9"/>
+              <w:left w:val="single" w:sz="4" w:color="D9D9D9"/>
+              <w:bottom w:val="single" w:sz="4" w:color="D9D9D9"/>
+              <w:right w:val="single" w:sz="4" w:color="D9D9D9"/>
+            </w:tcBorders>
+          </w:tcPr>
+          <w:p>
+            <w:pPr>
+              <w:spacing w:after="60"/>
+            </w:pPr>
+            <w:r>
+              <w:rPr>
+                <w:b w:val="0"/>
+                <w:sz w:val="21"/>
+              </w:rPr>
+              <w:t>Versionado y publicación</w:t>
+            </w:r>
+          </w:p>
+        </w:tc>
+        <w:tc>
+          <w:tcPr>
+            <w:tcW w:type="dxa" w:w="2592"/>
+            <w:vAlign w:val="center"/>
+            <w:shd w:fill="FFFFFF"/>
+            <w:tcMar>
+              <w:top w:w="100" w:type="dxa"/>
+              <w:left w:w="100" w:type="dxa"/>
+              <w:bottom w:w="100" w:type="dxa"/>
+              <w:right w:w="100" w:type="dxa"/>
+            </w:tcMar>
+            <w:tcBorders>
+              <w:top w:val="single" w:sz="4" w:color="D9D9D9"/>
+              <w:left w:val="single" w:sz="4" w:color="D9D9D9"/>
+              <w:bottom w:val="single" w:sz="4" w:color="D9D9D9"/>
+              <w:right w:val="single" w:sz="4" w:color="D9D9D9"/>
+            </w:tcBorders>
+          </w:tcPr>
+          <w:p>
+            <w:pPr>
+              <w:spacing w:after="60"/>
+            </w:pPr>
+            <w:r>
+              <w:rPr>
+                <w:b w:val="0"/>
+                <w:sz w:val="21"/>
+              </w:rPr>
+              <w:t>Git, GitHub y GitHub Actions</w:t>
+            </w:r>
+          </w:p>
+        </w:tc>
+        <w:tc>
+          <w:tcPr>
+            <w:tcW w:type="dxa" w:w="5688"/>
+            <w:vAlign w:val="center"/>
+            <w:shd w:fill="FFFFFF"/>
+            <w:tcMar>
+              <w:top w:w="100" w:type="dxa"/>
+              <w:left w:w="100" w:type="dxa"/>
+              <w:bottom w:w="100" w:type="dxa"/>
+              <w:right w:w="100" w:type="dxa"/>
+            </w:tcMar>
+            <w:tcBorders>
+              <w:top w:val="single" w:sz="4" w:color="D9D9D9"/>
+              <w:left w:val="single" w:sz="4" w:color="D9D9D9"/>
+              <w:bottom w:val="single" w:sz="4" w:color="D9D9D9"/>
+              <w:right w:val="single" w:sz="4" w:color="D9D9D9"/>
+            </w:tcBorders>
+          </w:tcPr>
+          <w:p>
+            <w:pPr>
+              <w:spacing w:after="60"/>
+            </w:pPr>
+            <w:r>
+              <w:rPr>
+                <w:b w:val="0"/>
+                <w:sz w:val="21"/>
+              </w:rPr>
+              <w:t>Historial del código y flujo de publicación de la demostración.</w:t>
+            </w:r>
+          </w:p>
+        </w:tc>
+      </w:tr>
+      <w:tr>
+        <w:trPr>
+          <w:cantSplit/>
+        </w:trPr>
+        <w:tc>
+          <w:tcPr>
+            <w:tcW w:type="dxa" w:w="1800"/>
+            <w:vAlign w:val="center"/>
+            <w:shd w:fill="FFFFFF"/>
+            <w:tcMar>
+              <w:top w:w="100" w:type="dxa"/>
+              <w:left w:w="100" w:type="dxa"/>
+              <w:bottom w:w="100" w:type="dxa"/>
+              <w:right w:w="100" w:type="dxa"/>
+            </w:tcMar>
+            <w:tcBorders>
+              <w:top w:val="single" w:sz="4" w:color="D9D9D9"/>
+              <w:left w:val="single" w:sz="4" w:color="D9D9D9"/>
+              <w:bottom w:val="single" w:sz="4" w:color="D9D9D9"/>
+              <w:right w:val="single" w:sz="4" w:color="D9D9D9"/>
+            </w:tcBorders>
+          </w:tcPr>
+          <w:p>
+            <w:pPr>
+              <w:spacing w:after="60"/>
+            </w:pPr>
+            <w:r>
+              <w:rPr>
+                <w:b w:val="0"/>
+                <w:sz w:val="21"/>
+              </w:rPr>
+              <w:t>Hosting público actual</w:t>
+            </w:r>
+          </w:p>
+        </w:tc>
+        <w:tc>
+          <w:tcPr>
+            <w:tcW w:type="dxa" w:w="2592"/>
+            <w:vAlign w:val="center"/>
+            <w:shd w:fill="FFFFFF"/>
+            <w:tcMar>
+              <w:top w:w="100" w:type="dxa"/>
+              <w:left w:w="100" w:type="dxa"/>
+              <w:bottom w:w="100" w:type="dxa"/>
+              <w:right w:w="100" w:type="dxa"/>
+            </w:tcMar>
+            <w:tcBorders>
+              <w:top w:val="single" w:sz="4" w:color="D9D9D9"/>
+              <w:left w:val="single" w:sz="4" w:color="D9D9D9"/>
+              <w:bottom w:val="single" w:sz="4" w:color="D9D9D9"/>
+              <w:right w:val="single" w:sz="4" w:color="D9D9D9"/>
+            </w:tcBorders>
+          </w:tcPr>
+          <w:p>
+            <w:pPr>
+              <w:spacing w:after="60"/>
+            </w:pPr>
+            <w:r>
+              <w:rPr>
+                <w:b w:val="0"/>
+                <w:sz w:val="21"/>
+              </w:rPr>
+              <w:t>GitHub Pages</w:t>
+            </w:r>
+          </w:p>
+        </w:tc>
+        <w:tc>
+          <w:tcPr>
+            <w:tcW w:type="dxa" w:w="5688"/>
+            <w:vAlign w:val="center"/>
+            <w:shd w:fill="FFFFFF"/>
+            <w:tcMar>
+              <w:top w:w="100" w:type="dxa"/>
+              <w:left w:w="100" w:type="dxa"/>
+              <w:bottom w:w="100" w:type="dxa"/>
+              <w:right w:w="100" w:type="dxa"/>
+            </w:tcMar>
+            <w:tcBorders>
+              <w:top w:val="single" w:sz="4" w:color="D9D9D9"/>
+              <w:left w:val="single" w:sz="4" w:color="D9D9D9"/>
+              <w:bottom w:val="single" w:sz="4" w:color="D9D9D9"/>
+              <w:right w:val="single" w:sz="4" w:color="D9D9D9"/>
+            </w:tcBorders>
+          </w:tcPr>
+          <w:p>
+            <w:pPr>
+              <w:spacing w:after="60"/>
+            </w:pPr>
+            <w:r>
+              <w:rPr>
+                <w:b w:val="0"/>
+                <w:sz w:val="21"/>
+              </w:rPr>
+              <w:t>Solo frontend estático de demostración. No aloja el backend ni SQLite.</w:t>
+            </w:r>
+          </w:p>
+        </w:tc>
+      </w:tr>
+      <w:tr>
+        <w:trPr>
+          <w:cantSplit/>
+        </w:trPr>
+        <w:tc>
+          <w:tcPr>
+            <w:tcW w:type="dxa" w:w="1800"/>
+            <w:vAlign w:val="center"/>
+            <w:shd w:fill="FFFFFF"/>
+            <w:tcMar>
+              <w:top w:w="100" w:type="dxa"/>
+              <w:left w:w="100" w:type="dxa"/>
+              <w:bottom w:w="100" w:type="dxa"/>
+              <w:right w:w="100" w:type="dxa"/>
+            </w:tcMar>
+            <w:tcBorders>
+              <w:top w:val="single" w:sz="4" w:color="D9D9D9"/>
+              <w:left w:val="single" w:sz="4" w:color="D9D9D9"/>
+              <w:bottom w:val="single" w:sz="4" w:color="D9D9D9"/>
+              <w:right w:val="single" w:sz="4" w:color="D9D9D9"/>
+            </w:tcBorders>
+          </w:tcPr>
+          <w:p>
+            <w:pPr>
+              <w:spacing w:after="60"/>
+            </w:pPr>
+            <w:r>
+              <w:rPr>
+                <w:b w:val="0"/>
+                <w:sz w:val="21"/>
+              </w:rPr>
+              <w:t>Despliegue preparado</w:t>
+            </w:r>
+          </w:p>
+        </w:tc>
+        <w:tc>
+          <w:tcPr>
+            <w:tcW w:type="dxa" w:w="2592"/>
+            <w:vAlign w:val="center"/>
+            <w:shd w:fill="FFFFFF"/>
+            <w:tcMar>
+              <w:top w:w="100" w:type="dxa"/>
+              <w:left w:w="100" w:type="dxa"/>
+              <w:bottom w:w="100" w:type="dxa"/>
+              <w:right w:w="100" w:type="dxa"/>
+            </w:tcMar>
+            <w:tcBorders>
+              <w:top w:val="single" w:sz="4" w:color="D9D9D9"/>
+              <w:left w:val="single" w:sz="4" w:color="D9D9D9"/>
+              <w:bottom w:val="single" w:sz="4" w:color="D9D9D9"/>
+              <w:right w:val="single" w:sz="4" w:color="D9D9D9"/>
+            </w:tcBorders>
+          </w:tcPr>
+          <w:p>
+            <w:pPr>
+              <w:spacing w:after="60"/>
+            </w:pPr>
+            <w:r>
+              <w:rPr>
+                <w:b w:val="0"/>
+                <w:sz w:val="21"/>
+              </w:rPr>
+              <w:t>Docker y Docker Compose</w:t>
+            </w:r>
+          </w:p>
+        </w:tc>
+        <w:tc>
+          <w:tcPr>
+            <w:tcW w:type="dxa" w:w="5688"/>
+            <w:vAlign w:val="center"/>
+            <w:shd w:fill="FFFFFF"/>
+            <w:tcMar>
+              <w:top w:w="100" w:type="dxa"/>
+              <w:left w:w="100" w:type="dxa"/>
+              <w:bottom w:w="100" w:type="dxa"/>
+              <w:right w:w="100" w:type="dxa"/>
+            </w:tcMar>
+            <w:tcBorders>
+              <w:top w:val="single" w:sz="4" w:color="D9D9D9"/>
+              <w:left w:val="single" w:sz="4" w:color="D9D9D9"/>
+              <w:bottom w:val="single" w:sz="4" w:color="D9D9D9"/>
+              <w:right w:val="single" w:sz="4" w:color="D9D9D9"/>
+            </w:tcBorders>
+          </w:tcPr>
+          <w:p>
+            <w:pPr>
+              <w:spacing w:after="60"/>
+            </w:pPr>
+            <w:r>
+              <w:rPr>
+                <w:b w:val="0"/>
+                <w:sz w:val="21"/>
+              </w:rPr>
+              <w:t>Archivos para una instancia con volúmenes persistentes. No acreditan un despliegue productivo activo.</w:t>
+            </w:r>
+          </w:p>
+        </w:tc>
+      </w:tr>
+      <w:tr>
+        <w:trPr>
+          <w:cantSplit/>
+        </w:trPr>
+        <w:tc>
+          <w:tcPr>
+            <w:tcW w:type="dxa" w:w="1800"/>
+            <w:vAlign w:val="center"/>
+            <w:shd w:fill="FFFFFF"/>
+            <w:tcMar>
+              <w:top w:w="100" w:type="dxa"/>
+              <w:left w:w="100" w:type="dxa"/>
+              <w:bottom w:w="100" w:type="dxa"/>
+              <w:right w:w="100" w:type="dxa"/>
+            </w:tcMar>
+            <w:tcBorders>
+              <w:top w:val="single" w:sz="4" w:color="D9D9D9"/>
+              <w:left w:val="single" w:sz="4" w:color="D9D9D9"/>
+              <w:bottom w:val="single" w:sz="4" w:color="D9D9D9"/>
+              <w:right w:val="single" w:sz="4" w:color="D9D9D9"/>
+            </w:tcBorders>
+          </w:tcPr>
+          <w:p>
+            <w:pPr>
+              <w:spacing w:after="60"/>
+            </w:pPr>
+            <w:r>
+              <w:rPr>
+                <w:b w:val="0"/>
+                <w:sz w:val="21"/>
+              </w:rPr>
+              <w:t>Migración parcial</w:t>
+            </w:r>
+          </w:p>
+        </w:tc>
+        <w:tc>
+          <w:tcPr>
+            <w:tcW w:type="dxa" w:w="2592"/>
+            <w:vAlign w:val="center"/>
+            <w:shd w:fill="FFFFFF"/>
+            <w:tcMar>
+              <w:top w:w="100" w:type="dxa"/>
+              <w:left w:w="100" w:type="dxa"/>
+              <w:bottom w:w="100" w:type="dxa"/>
+              <w:right w:w="100" w:type="dxa"/>
+            </w:tcMar>
+            <w:tcBorders>
+              <w:top w:val="single" w:sz="4" w:color="D9D9D9"/>
+              <w:left w:val="single" w:sz="4" w:color="D9D9D9"/>
+              <w:bottom w:val="single" w:sz="4" w:color="D9D9D9"/>
+              <w:right w:val="single" w:sz="4" w:color="D9D9D9"/>
+            </w:tcBorders>
+          </w:tcPr>
+          <w:p>
+            <w:pPr>
+              <w:spacing w:after="60"/>
+            </w:pPr>
+            <w:r>
+              <w:rPr>
+                <w:b w:val="0"/>
+                <w:sz w:val="21"/>
+              </w:rPr>
+              <w:t>PostgreSQL y pg</w:t>
+            </w:r>
+          </w:p>
+        </w:tc>
+        <w:tc>
+          <w:tcPr>
+            <w:tcW w:type="dxa" w:w="5688"/>
+            <w:vAlign w:val="center"/>
+            <w:shd w:fill="FFFFFF"/>
+            <w:tcMar>
+              <w:top w:w="100" w:type="dxa"/>
+              <w:left w:w="100" w:type="dxa"/>
+              <w:bottom w:w="100" w:type="dxa"/>
+              <w:right w:w="100" w:type="dxa"/>
+            </w:tcMar>
+            <w:tcBorders>
+              <w:top w:val="single" w:sz="4" w:color="D9D9D9"/>
+              <w:left w:val="single" w:sz="4" w:color="D9D9D9"/>
+              <w:bottom w:val="single" w:sz="4" w:color="D9D9D9"/>
+              <w:right w:val="single" w:sz="4" w:color="D9D9D9"/>
+            </w:tcBorders>
+          </w:tcPr>
+          <w:p>
+            <w:pPr>
+              <w:spacing w:after="60"/>
+            </w:pPr>
+            <w:r>
+              <w:rPr>
+                <w:b w:val="0"/>
+                <w:sz w:val="21"/>
+              </w:rPr>
+              <w:t>Esquema y adaptadores preparados. El backend completo sigue usando SQLite.</w:t>
+            </w:r>
+          </w:p>
+        </w:tc>
+      </w:tr>
+    </w:tbl>
+    <w:p>
+      <w:r>
+        <w:t>Visual Studio Code permite editar y ejecutar comandos, pero no es una dependencia del servidor. No se utiliza PHP, Laravel, MySQL, XAMPP ni Hostinger en el alojamiento actual del proyecto. El hardware del informe corresponde al backend completo de una instancia; para visitar la demostración pública basta un navegador.</w:t>
+      </w:r>
+    </w:p>
+    <w:p>
+      <w:r>
+        <w:br w:type="page"/>
+      </w:r>
+    </w:p>
+    <w:p>
       <w:pPr>
         <w:pStyle w:val="Heading1"/>
       </w:pPr>

</xml_diff>